<commit_message>
Course: drop the hours dial; warmer, lead-first copy across modules and lessons
Co-Authored-By: Claude Fable 5.1 <noreply@anthropic.com>
</commit_message>
<xml_diff>
--- a/public/course/module-1-workbook.docx
+++ b/public/course/module-1-workbook.docx
@@ -471,7 +471,7 @@
                 <w:sz w:val="18"/>
                 <w:szCs w:val="18"/>
               </w:rPr>
-              <w:t xml:space="preserve">Stage, income floor, hours, date</w:t>
+              <w:t xml:space="preserve">Stage, income floor, date</w:t>
             </w:r>
           </w:p>
         </w:tc>
@@ -896,7 +896,7 @@
                 <w:sz w:val="18"/>
                 <w:szCs w:val="18"/>
               </w:rPr>
-              <w:t xml:space="preserve">Five dials, three paths</w:t>
+              <w:t xml:space="preserve">Four dials, three paths</w:t>
             </w:r>
           </w:p>
         </w:tc>
@@ -2035,81 +2035,7 @@
           <w:sz w:val="24"/>
           <w:szCs w:val="24"/>
         </w:rPr>
-        <w:t xml:space="preserve">4. Hours you can put in, per week, outside work</w:t>
-      </w:r>
-    </w:p>
-    <w:p>
-      <w:pPr>
-        <w:spacing w:after="40" w:before="100"/>
-      </w:pPr>
-      <w:r>
-        <w:rPr>
-          <w:rFonts w:ascii="Calibri" w:cs="Calibri" w:eastAsia="Calibri" w:hAnsi="Calibri"/>
-          <w:b/>
-          <w:bCs/>
-          <w:color w:val="1B1B1E"/>
-          <w:sz w:val="21"/>
-          <w:szCs w:val="21"/>
-        </w:rPr>
-        <w:t xml:space="preserve">Realistically, this month</w:t>
-      </w:r>
-    </w:p>
-    <w:p>
-      <w:pPr>
-        <w:tabs>
-          <w:tab w:val="right" w:pos="9360"/>
-        </w:tabs>
-        <w:spacing w:after="20"/>
-      </w:pPr>
-      <w:r>
-        <w:rPr>
-          <w:rFonts w:ascii="Calibri" w:cs="Calibri" w:eastAsia="Calibri" w:hAnsi="Calibri"/>
-          <w:color w:val="6B7280"/>
-          <w:sz w:val="18"/>
-          <w:szCs w:val="18"/>
-        </w:rPr>
-        <w:t xml:space="preserve">Running on empty</w:t>
-      </w:r>
-      <w:r>
-        <w:rPr>
-          <w:rFonts w:ascii="Calibri" w:cs="Calibri" w:eastAsia="Calibri" w:hAnsi="Calibri"/>
-          <w:color w:val="6B7280"/>
-          <w:sz w:val="18"/>
-          <w:szCs w:val="18"/>
-        </w:rPr>
-        <w:t xml:space="preserve">	A defined sprint</w:t>
-      </w:r>
-    </w:p>
-    <w:p>
-      <w:pPr>
-        <w:spacing w:after="140"/>
-        <w:jc w:val="center"/>
-      </w:pPr>
-      <w:r>
-        <w:rPr>
-          <w:rFonts w:ascii="Segoe UI Symbol" w:cs="Segoe UI Symbol" w:eastAsia="Segoe UI Symbol" w:hAnsi="Segoe UI Symbol"/>
-          <w:color w:val="2D6A4F"/>
-          <w:sz w:val="26"/>
-          <w:szCs w:val="26"/>
-        </w:rPr>
-        <w:t xml:space="preserve">○ — ○ — ○ — ○ — ○ — ○ — ○</w:t>
-      </w:r>
-    </w:p>
-    <w:p>
-      <w:pPr>
-        <w:pStyle w:val="Heading2"/>
-        <w:spacing w:after="80" w:before="240"/>
-      </w:pPr>
-      <w:r>
-        <w:rPr>
-          <w:rFonts w:ascii="Calibri" w:cs="Calibri" w:eastAsia="Calibri" w:hAnsi="Calibri"/>
-          <w:b/>
-          <w:bCs/>
-          <w:color w:val="1B1B1E"/>
-          <w:sz w:val="24"/>
-          <w:szCs w:val="24"/>
-        </w:rPr>
-        <w:t xml:space="preserve">5. Target date</w:t>
+        <w:t xml:space="preserve">4. Target date</w:t>
       </w:r>
     </w:p>
     <w:tbl>
@@ -5425,7 +5351,7 @@
           <w:sz w:val="22"/>
           <w:szCs w:val="22"/>
         </w:rPr>
-        <w:t xml:space="preserve">Five dials. Mark where you are this month, not where you'd like to be.</w:t>
+        <w:t xml:space="preserve">Four dials. Mark where you are this month, not where you'd like to be.</w:t>
       </w:r>
     </w:p>
     <w:p>
@@ -5468,63 +5394,6 @@
           <w:szCs w:val="18"/>
         </w:rPr>
         <w:t xml:space="preserve">	Must match SLP pay now</w:t>
-      </w:r>
-    </w:p>
-    <w:p>
-      <w:pPr>
-        <w:spacing w:after="140"/>
-        <w:jc w:val="center"/>
-      </w:pPr>
-      <w:r>
-        <w:rPr>
-          <w:rFonts w:ascii="Segoe UI Symbol" w:cs="Segoe UI Symbol" w:eastAsia="Segoe UI Symbol" w:hAnsi="Segoe UI Symbol"/>
-          <w:color w:val="2D6A4F"/>
-          <w:sz w:val="26"/>
-          <w:szCs w:val="26"/>
-        </w:rPr>
-        <w:t xml:space="preserve">○ — ○ — ○ — ○ — ○ — ○ — ○</w:t>
-      </w:r>
-    </w:p>
-    <w:p>
-      <w:pPr>
-        <w:spacing w:after="40" w:before="100"/>
-      </w:pPr>
-      <w:r>
-        <w:rPr>
-          <w:rFonts w:ascii="Calibri" w:cs="Calibri" w:eastAsia="Calibri" w:hAnsi="Calibri"/>
-          <w:b/>
-          <w:bCs/>
-          <w:color w:val="1B1B1E"/>
-          <w:sz w:val="21"/>
-          <w:szCs w:val="21"/>
-        </w:rPr>
-        <w:t xml:space="preserve">Hours outside work</w:t>
-      </w:r>
-    </w:p>
-    <w:p>
-      <w:pPr>
-        <w:tabs>
-          <w:tab w:val="right" w:pos="9360"/>
-        </w:tabs>
-        <w:spacing w:after="20"/>
-      </w:pPr>
-      <w:r>
-        <w:rPr>
-          <w:rFonts w:ascii="Calibri" w:cs="Calibri" w:eastAsia="Calibri" w:hAnsi="Calibri"/>
-          <w:color w:val="6B7280"/>
-          <w:sz w:val="18"/>
-          <w:szCs w:val="18"/>
-        </w:rPr>
-        <w:t xml:space="preserve">Running on empty</w:t>
-      </w:r>
-      <w:r>
-        <w:rPr>
-          <w:rFonts w:ascii="Calibri" w:cs="Calibri" w:eastAsia="Calibri" w:hAnsi="Calibri"/>
-          <w:color w:val="6B7280"/>
-          <w:sz w:val="18"/>
-          <w:szCs w:val="18"/>
-        </w:rPr>
-        <w:t xml:space="preserve">	A defined sprint</w:t>
       </w:r>
     </w:p>
     <w:p>

</xml_diff>